<commit_message>
Syllabus docx: suggested readings removed from schedule
Co-Authored-By: Claude Fable 5.1 <noreply@anthropic.com>
Claude-Session: https://claude.ai/code/session_01HSpGjam7AsR2y7XqzyMftt
</commit_message>
<xml_diff>
--- a/syllabus/Intro_Climate_Modeling_Syllabus_Fall2026.docx
+++ b/syllabus/Intro_Climate_Modeling_Syllabus_Fall2026.docx
@@ -640,10 +640,7 @@
     <w:p/>
     <w:p>
       <w:r>
-        <w:t>The course is loosely based on a few books. There will</w:t>
-      </w:r>
-      <w:r>
-        <w:t xml:space="preserve"> be suggested readings from these texts each week as extra supplemental learning in addition to the classroom teaching:</w:t>
+        <w:t>The course is loosely based on a few books, which may be used as extra supplemental reading in addition to the classroom teaching:</w:t>
       </w:r>
     </w:p>
     <w:p>
@@ -2463,12 +2460,6 @@
               <w:t>History and motivation for earth system modeling, overview of model hierarchy from simple to complex</w:t>
             </w:r>
           </w:p>
-          <w:p>
-            <w:r>
-              <w:br/>
-              <w:t>Suggested reading: A Climate Modeling Primer Chapter 1 and 2</w:t>
-            </w:r>
-          </w:p>
         </w:tc>
         <w:tc>
           <w:tcPr>
@@ -2573,12 +2564,6 @@
               <w:t>Radiative balance, greenhouse effect, 0 and 1D EBMs</w:t>
             </w:r>
           </w:p>
-          <w:p/>
-          <w:p>
-            <w:r>
-              <w:t>Suggested reading: A Climate Modeling Primer Chapter 3</w:t>
-            </w:r>
-          </w:p>
         </w:tc>
         <w:tc>
           <w:tcPr>
@@ -2683,12 +2668,6 @@
               <w:t>Time dependent EBMs, ice-albedo feedbacks, diffusive energy transport</w:t>
             </w:r>
           </w:p>
-          <w:p/>
-          <w:p>
-            <w:r>
-              <w:t>Suggested reading: A Climate Modeling Primer Chapter 3</w:t>
-            </w:r>
-          </w:p>
         </w:tc>
         <w:tc>
           <w:tcPr>
@@ -2784,14 +2763,7 @@
           </w:tcPr>
           <w:p>
             <w:r>
-              <w:t xml:space="preserve">Box models for large scale circulations </w:t>
-            </w:r>
-          </w:p>
-          <w:p/>
-          <w:p>
-            <w:r>
-              <w:lastRenderedPageBreak/>
-              <w:t>Suggested readings: A Climate Modeling Primer Chapter 4</w:t>
+              <w:t>Box models for large scale circulations</w:t>
             </w:r>
           </w:p>
         </w:tc>
@@ -2893,12 +2865,6 @@
               <w:t>3D models of the climate system components - atmosphere</w:t>
             </w:r>
           </w:p>
-          <w:p/>
-          <w:p>
-            <w:r>
-              <w:t>Suggested reading: A Climate Modeling Primer Chapter 4, 5</w:t>
-            </w:r>
-          </w:p>
         </w:tc>
         <w:tc>
           <w:tcPr>
@@ -2996,12 +2962,6 @@
           <w:p>
             <w:r>
               <w:t>3D models of the climate system components - ocean and cryosphere</w:t>
-            </w:r>
-          </w:p>
-          <w:p/>
-          <w:p>
-            <w:r>
-              <w:t>Suggested reading: A Climate Modeling Primer Chapter 5</w:t>
             </w:r>
           </w:p>
         </w:tc>
@@ -3108,13 +3068,6 @@
             <w:r>
               <w:t>Land-atmosphere interactions, surface energy and water budgets, soil and vegetation models</w:t>
             </w:r>
-            <w:r>
-              <w:br/>
-            </w:r>
-            <w:r>
-              <w:br/>
-              <w:t>Suggested reading: A Climate Modeling Primer Chapter 5</w:t>
-            </w:r>
           </w:p>
         </w:tc>
         <w:tc>
@@ -3214,13 +3167,6 @@
             <w:r>
               <w:t>Ocean and terrestrial carbon reservoirs, biogeochemical cycles</w:t>
             </w:r>
-            <w:r>
-              <w:br/>
-            </w:r>
-            <w:r>
-              <w:br/>
-              <w:t>Suggested reading: A Climate Modeling Primer Chapter 5</w:t>
-            </w:r>
           </w:p>
         </w:tc>
         <w:tc>
@@ -3318,13 +3264,7 @@
           </w:tcPr>
           <w:p>
             <w:r>
-              <w:t xml:space="preserve">Water vapor, ice-albedo, cloud, lapse-rate feedback, ECS, TCR </w:t>
-            </w:r>
-          </w:p>
-          <w:p/>
-          <w:p>
-            <w:r>
-              <w:t>Suggested reading: A Climate Modeling Primer Chapter 1, 5</w:t>
+              <w:t>Water vapor, ice-albedo, cloud, lapse-rate feedback, ECS, TCR</w:t>
             </w:r>
           </w:p>
         </w:tc>
@@ -3529,7 +3469,7 @@
           </w:tcPr>
           <w:p>
             <w:r>
-              <w:t xml:space="preserve">CMIP6/7 experimental design, SSPs, MIPs </w:t>
+              <w:t>CMIP6/7 experimental design, SSPs, MIPs</w:t>
             </w:r>
           </w:p>
         </w:tc>
@@ -3738,7 +3678,7 @@
               <w:t>Transient climate response, regional projections, downscaling, detection and attribution, us</w:t>
             </w:r>
             <w:r>
-              <w:t xml:space="preserve">e of AI for enhancing models and projections. </w:t>
+              <w:t>e of AI for enhancing models and projections.</w:t>
             </w:r>
           </w:p>
         </w:tc>

</xml_diff>

<commit_message>
Syllabus docx: labs almost every week
Co-Authored-By: Claude Fable 5.1 <noreply@anthropic.com>
Claude-Session: https://claude.ai/code/session_01HSpGjam7AsR2y7XqzyMftt
</commit_message>
<xml_diff>
--- a/syllabus/Intro_Climate_Modeling_Syllabus_Fall2026.docx
+++ b/syllabus/Intro_Climate_Modeling_Syllabus_Fall2026.docx
@@ -1143,7 +1143,7 @@
           </w:tcPr>
           <w:p>
             <w:r>
-              <w:t>5 weeks</w:t>
+              <w:t>Almost all weeks</w:t>
             </w:r>
           </w:p>
         </w:tc>
@@ -1681,7 +1681,7 @@
     </w:p>
     <w:p>
       <w:r>
-        <w:t xml:space="preserve">There will be a Lab session every few weeks, which would involve going over the computational aspects of the concepts that are being discussed in class. During these sessions the students would be required to use their laptops to follow along using the </w:t>
+        <w:t xml:space="preserve">There will be a Lab session almost every week, which would involve going over the computational aspects of the concepts that are being discussed in class. During these sessions the students would be required to use their laptops to follow along using the </w:t>
       </w:r>
       <w:proofErr w:type="spellStart"/>
       <w:r>

</xml_diff>

<commit_message>
Remove fixed homework deadlines and allow four to five assignments
</commit_message>
<xml_diff>
--- a/syllabus/Intro_Climate_Modeling_Syllabus_Fall2026.docx
+++ b/syllabus/Intro_Climate_Modeling_Syllabus_Fall2026.docx
@@ -1236,7 +1236,7 @@
           </w:tcPr>
           <w:p>
             <w:r>
-              <w:t>5 weeks</w:t>
+              <w:t>4–5 assignments</w:t>
             </w:r>
           </w:p>
         </w:tc>
@@ -1258,7 +1258,7 @@
           </w:tcPr>
           <w:p>
             <w:r>
-              <w:t>2 weeks after HW was assigned</w:t>
+              <w:t>See Courseworks</w:t>
             </w:r>
           </w:p>
         </w:tc>
@@ -1785,7 +1785,7 @@
         <w:rPr>
           <w:highlight w:val="white"/>
         </w:rPr>
-        <w:t>There will be 5 assignments. Similar to the labs, these assignments will usually be in the fo</w:t>
+        <w:t>There will be 4–5 assignments. Similar to the labs, these assignments will usually be in the fo</w:t>
       </w:r>
       <w:r>
         <w:rPr>
@@ -1828,7 +1828,7 @@
         </w:rPr>
       </w:pPr>
       <w:r>
-        <w:t xml:space="preserve">Details will be provided as needed. </w:t>
+        <w:t xml:space="preserve">Homework details and due dates will be posted on Courseworks. </w:t>
       </w:r>
     </w:p>
     <w:p>
@@ -2385,7 +2385,7 @@
                 <w:color w:val="ffffff"/>
                 <w:rtl w:val="0"/>
               </w:rPr>
-              <w:t>Homeworks</w:t>
+              <w:t>Project deadlines</w:t>
             </w:r>
           </w:p>
         </w:tc>
@@ -2791,7 +2791,6 @@
               <w:rPr>
                 <w:rtl w:val="0"/>
               </w:rPr>
-              <w:t>HW1 due</w:t>
             </w:r>
           </w:p>
         </w:tc>
@@ -2989,7 +2988,6 @@
               <w:rPr>
                 <w:rtl w:val="0"/>
               </w:rPr>
-              <w:t>HW2 due</w:t>
             </w:r>
           </w:p>
         </w:tc>
@@ -3193,7 +3191,6 @@
               <w:rPr>
                 <w:rtl w:val="0"/>
               </w:rPr>
-              <w:t>HW3 due</w:t>
             </w:r>
           </w:p>
         </w:tc>
@@ -3398,7 +3395,6 @@
               <w:rPr>
                 <w:rtl w:val="0"/>
               </w:rPr>
-              <w:t>HW4 due</w:t>
             </w:r>
           </w:p>
         </w:tc>
@@ -3706,7 +3702,6 @@
               <w:rPr>
                 <w:rtl w:val="0"/>
               </w:rPr>
-              <w:t>HW 5 due</w:t>
             </w:r>
           </w:p>
         </w:tc>

</xml_diff>

<commit_message>
Publish removal of October 9 project title deadline
</commit_message>
<xml_diff>
--- a/syllabus/Intro_Climate_Modeling_Syllabus_Fall2026.docx
+++ b/syllabus/Intro_Climate_Modeling_Syllabus_Fall2026.docx
@@ -1329,7 +1329,7 @@
           </w:tcPr>
           <w:p>
             <w:r>
-              <w:t>Weeks 5 and 7</w:t>
+              <w:t>Week 7</w:t>
             </w:r>
           </w:p>
         </w:tc>
@@ -1351,7 +1351,7 @@
           </w:tcPr>
           <w:p>
             <w:r>
-              <w:t>Title: Friday 9 October. Proposal: Friday 23 October.</w:t>
+              <w:t xml:space="preserve">Proposal: Friday 23 October.</w:t>
             </w:r>
           </w:p>
         </w:tc>
@@ -1972,13 +1972,13 @@
         <w:rPr>
           <w:highlight w:val="white"/>
         </w:rPr>
-        <w:t>Topics should be submitted to t</w:t>
-      </w:r>
-      <w:r>
-        <w:rPr>
-          <w:highlight w:val="white"/>
-        </w:rPr>
-        <w:t>he instructor by Friday of the 5th week of classes (October 9) for approval, and a short proposal will be due in week 7, Friday October 23 (</w:t>
+        <w:t xml:space="preserve">A short proposal will be due</w:t>
+      </w:r>
+      <w:r>
+        <w:rPr>
+          <w:highlight w:val="white"/>
+        </w:rPr>
+        <w:t xml:space="preserve"> in week 7, Friday October 23 (</w:t>
       </w:r>
       <w:proofErr w:type="gramStart"/>
       <w:r>
@@ -1992,7 +1992,7 @@
         <w:rPr>
           <w:highlight w:val="white"/>
         </w:rPr>
-        <w:t xml:space="preserve"> max). Timely submission of these components will count towards 10% of the grade, and late assignment policy (</w:t>
+        <w:t xml:space="preserve"> max). Timely submission of the proposal will count towards 10% of the grade, and late assignment policy (</w:t>
       </w:r>
       <w:r>
         <w:rPr>
@@ -2889,7 +2889,7 @@
               <w:rPr>
                 <w:rtl w:val="0"/>
               </w:rPr>
-              <w:t>Final project title due (9 Oct)</w:t>
+              <w:t xml:space="preserve"/>
             </w:r>
           </w:p>
         </w:tc>

</xml_diff>

<commit_message>
Remove October 9 project title deadline from website and syllabus
</commit_message>
<xml_diff>
--- a/syllabus/Intro_Climate_Modeling_Syllabus_Fall2026.docx
+++ b/syllabus/Intro_Climate_Modeling_Syllabus_Fall2026.docx
@@ -1329,7 +1329,7 @@
           </w:tcPr>
           <w:p>
             <w:r>
-              <w:t>Weeks 5 and 7</w:t>
+              <w:t>Week 7</w:t>
             </w:r>
           </w:p>
         </w:tc>
@@ -1351,7 +1351,7 @@
           </w:tcPr>
           <w:p>
             <w:r>
-              <w:t>Title: Friday 9 October. Proposal: Friday 23 October.</w:t>
+              <w:t xml:space="preserve">Proposal: Friday 23 October.</w:t>
             </w:r>
           </w:p>
         </w:tc>
@@ -1972,13 +1972,13 @@
         <w:rPr>
           <w:highlight w:val="white"/>
         </w:rPr>
-        <w:t>Topics should be submitted to t</w:t>
-      </w:r>
-      <w:r>
-        <w:rPr>
-          <w:highlight w:val="white"/>
-        </w:rPr>
-        <w:t>he instructor by Friday of the 5th week of classes (October 9) for approval, and a short proposal will be due in week 7, Friday October 23 (</w:t>
+        <w:t xml:space="preserve">A short proposal will be due</w:t>
+      </w:r>
+      <w:r>
+        <w:rPr>
+          <w:highlight w:val="white"/>
+        </w:rPr>
+        <w:t xml:space="preserve"> in week 7, Friday October 23 (</w:t>
       </w:r>
       <w:proofErr w:type="gramStart"/>
       <w:r>
@@ -1992,7 +1992,7 @@
         <w:rPr>
           <w:highlight w:val="white"/>
         </w:rPr>
-        <w:t xml:space="preserve"> max). Timely submission of these components will count towards 10% of the grade, and late assignment policy (</w:t>
+        <w:t xml:space="preserve"> max). Timely submission of the proposal will count towards 10% of the grade, and late assignment policy (</w:t>
       </w:r>
       <w:r>
         <w:rPr>
@@ -2889,7 +2889,7 @@
               <w:rPr>
                 <w:rtl w:val="0"/>
               </w:rPr>
-              <w:t>Final project title due (9 Oct)</w:t>
+              <w:t xml:space="preserve"/>
             </w:r>
           </w:p>
         </w:tc>

</xml_diff>

<commit_message>
Publish project topic and team selection milestone
</commit_message>
<xml_diff>
--- a/syllabus/Intro_Climate_Modeling_Syllabus_Fall2026.docx
+++ b/syllabus/Intro_Climate_Modeling_Syllabus_Fall2026.docx
@@ -1285,7 +1285,7 @@
           </w:tcPr>
           <w:p>
             <w:r>
-              <w:t>Final project proposal</w:t>
+              <w:t xml:space="preserve">Project topic and team selection</w:t>
             </w:r>
           </w:p>
         </w:tc>
@@ -1351,7 +1351,7 @@
           </w:tcPr>
           <w:p>
             <w:r>
-              <w:t xml:space="preserve">Proposal: Friday 23 October.</w:t>
+              <w:t xml:space="preserve">Friday 23 October.</w:t>
             </w:r>
           </w:p>
         </w:tc>
@@ -1857,7 +1857,7 @@
           <w:sz w:val="24"/>
           <w:szCs w:val="24"/>
         </w:rPr>
-        <w:t xml:space="preserve">Final project (35% = </w:t>
+        <w:t xml:space="preserve">Final project (35%)</w:t>
       </w:r>
       <w:r>
         <w:rPr>
@@ -1867,7 +1867,7 @@
           <w:sz w:val="24"/>
           <w:szCs w:val="24"/>
         </w:rPr>
-        <w:t>proposal 10% + project 25%)</w:t>
+        <w:t xml:space="preserve"/>
       </w:r>
     </w:p>
     <w:p>
@@ -1972,33 +1972,33 @@
         <w:rPr>
           <w:highlight w:val="white"/>
         </w:rPr>
-        <w:t xml:space="preserve">A short proposal will be due</w:t>
-      </w:r>
-      <w:r>
-        <w:rPr>
-          <w:highlight w:val="white"/>
-        </w:rPr>
-        <w:t xml:space="preserve"> in week 7, Friday October 23 (</w:t>
+        <w:t xml:space="preserve">Project topic and team selection is due in week 7, Friday October 23. Timely submission will count towards 10% of the grade, and late assignment policy (see below) would apply.</w:t>
+      </w:r>
+      <w:r>
+        <w:rPr>
+          <w:highlight w:val="white"/>
+        </w:rPr>
+        <w:t xml:space="preserve"/>
       </w:r>
       <w:proofErr w:type="gramStart"/>
       <w:r>
         <w:rPr>
           <w:highlight w:val="white"/>
         </w:rPr>
-        <w:t>1 page</w:t>
+        <w:t xml:space="preserve"/>
       </w:r>
       <w:proofErr w:type="gramEnd"/>
       <w:r>
         <w:rPr>
           <w:highlight w:val="white"/>
         </w:rPr>
-        <w:t xml:space="preserve"> max). Timely submission of the proposal will count towards 10% of the grade, and late assignment policy (</w:t>
-      </w:r>
-      <w:r>
-        <w:rPr>
-          <w:highlight w:val="white"/>
-        </w:rPr>
-        <w:t xml:space="preserve">see below) would apply. </w:t>
+        <w:t xml:space="preserve"/>
+      </w:r>
+      <w:r>
+        <w:rPr>
+          <w:highlight w:val="white"/>
+        </w:rPr>
+        <w:t xml:space="preserve"> </w:t>
       </w:r>
     </w:p>
     <w:p>
@@ -2022,14 +2022,14 @@
           <w:highlight w:val="white"/>
         </w:rPr>
         <w:lastRenderedPageBreak/>
-        <w:t>The project proposal must include a short write up of the planned work, annotated reference to any papers that will be used to design the project, and a confirmation that the datasets needed for the project have been identified an</w:t>
+        <w:t xml:space="preserve">Submit your selected project topic and the names of your team members.</w:t>
       </w:r>
       <w:r>
         <w:rPr>
           <w:color w:val="262626"/>
           <w:highlight w:val="white"/>
         </w:rPr>
-        <w:t xml:space="preserve">d checked for accessibility. </w:t>
+        <w:t xml:space="preserve"> </w:t>
       </w:r>
     </w:p>
     <w:p>
@@ -3092,7 +3092,7 @@
               <w:rPr>
                 <w:rtl w:val="0"/>
               </w:rPr>
-              <w:t>Final project proposal due (23 Oct)</w:t>
+              <w:t xml:space="preserve">Project topic and team selection due (23 Oct)</w:t>
             </w:r>
           </w:p>
         </w:tc>

</xml_diff>

<commit_message>
Replace project proposal milestone with topic and team selection
</commit_message>
<xml_diff>
--- a/syllabus/Intro_Climate_Modeling_Syllabus_Fall2026.docx
+++ b/syllabus/Intro_Climate_Modeling_Syllabus_Fall2026.docx
@@ -1285,7 +1285,7 @@
           </w:tcPr>
           <w:p>
             <w:r>
-              <w:t>Final project proposal</w:t>
+              <w:t xml:space="preserve">Project topic and team selection</w:t>
             </w:r>
           </w:p>
         </w:tc>
@@ -1351,7 +1351,7 @@
           </w:tcPr>
           <w:p>
             <w:r>
-              <w:t xml:space="preserve">Proposal: Friday 23 October.</w:t>
+              <w:t xml:space="preserve">Friday 23 October.</w:t>
             </w:r>
           </w:p>
         </w:tc>
@@ -1857,7 +1857,7 @@
           <w:sz w:val="24"/>
           <w:szCs w:val="24"/>
         </w:rPr>
-        <w:t xml:space="preserve">Final project (35% = </w:t>
+        <w:t xml:space="preserve">Final project (35%)</w:t>
       </w:r>
       <w:r>
         <w:rPr>
@@ -1867,7 +1867,7 @@
           <w:sz w:val="24"/>
           <w:szCs w:val="24"/>
         </w:rPr>
-        <w:t>proposal 10% + project 25%)</w:t>
+        <w:t xml:space="preserve"/>
       </w:r>
     </w:p>
     <w:p>
@@ -1972,33 +1972,33 @@
         <w:rPr>
           <w:highlight w:val="white"/>
         </w:rPr>
-        <w:t xml:space="preserve">A short proposal will be due</w:t>
-      </w:r>
-      <w:r>
-        <w:rPr>
-          <w:highlight w:val="white"/>
-        </w:rPr>
-        <w:t xml:space="preserve"> in week 7, Friday October 23 (</w:t>
+        <w:t xml:space="preserve">Project topic and team selection is due in week 7, Friday October 23. Timely submission will count towards 10% of the grade, and late assignment policy (see below) would apply.</w:t>
+      </w:r>
+      <w:r>
+        <w:rPr>
+          <w:highlight w:val="white"/>
+        </w:rPr>
+        <w:t xml:space="preserve"/>
       </w:r>
       <w:proofErr w:type="gramStart"/>
       <w:r>
         <w:rPr>
           <w:highlight w:val="white"/>
         </w:rPr>
-        <w:t>1 page</w:t>
+        <w:t xml:space="preserve"/>
       </w:r>
       <w:proofErr w:type="gramEnd"/>
       <w:r>
         <w:rPr>
           <w:highlight w:val="white"/>
         </w:rPr>
-        <w:t xml:space="preserve"> max). Timely submission of the proposal will count towards 10% of the grade, and late assignment policy (</w:t>
-      </w:r>
-      <w:r>
-        <w:rPr>
-          <w:highlight w:val="white"/>
-        </w:rPr>
-        <w:t xml:space="preserve">see below) would apply. </w:t>
+        <w:t xml:space="preserve"/>
+      </w:r>
+      <w:r>
+        <w:rPr>
+          <w:highlight w:val="white"/>
+        </w:rPr>
+        <w:t xml:space="preserve"> </w:t>
       </w:r>
     </w:p>
     <w:p>
@@ -2022,14 +2022,14 @@
           <w:highlight w:val="white"/>
         </w:rPr>
         <w:lastRenderedPageBreak/>
-        <w:t>The project proposal must include a short write up of the planned work, annotated reference to any papers that will be used to design the project, and a confirmation that the datasets needed for the project have been identified an</w:t>
+        <w:t xml:space="preserve">Submit your selected project topic and the names of your team members.</w:t>
       </w:r>
       <w:r>
         <w:rPr>
           <w:color w:val="262626"/>
           <w:highlight w:val="white"/>
         </w:rPr>
-        <w:t xml:space="preserve">d checked for accessibility. </w:t>
+        <w:t xml:space="preserve"> </w:t>
       </w:r>
     </w:p>
     <w:p>
@@ -3092,7 +3092,7 @@
               <w:rPr>
                 <w:rtl w:val="0"/>
               </w:rPr>
-              <w:t>Final project proposal due (23 Oct)</w:t>
+              <w:t xml:space="preserve">Project topic and team selection due (23 Oct)</w:t>
             </w:r>
           </w:p>
         </w:tc>

</xml_diff>

<commit_message>
Update syllabus office hours wording
</commit_message>
<xml_diff>
--- a/syllabus/Intro_Climate_Modeling_Syllabus_Fall2026.docx
+++ b/syllabus/Intro_Climate_Modeling_Syllabus_Fall2026.docx
@@ -120,15 +120,15 @@
     </w:p>
     <w:p>
       <w:r>
-        <w:t xml:space="preserve">Office hours: TBD (to be announced on </w:t>
+        <w:t xml:space="preserve">Office hours: As discussed by TAs</w:t>
       </w:r>
       <w:proofErr w:type="spellStart"/>
       <w:r>
-        <w:t>Courseworks</w:t>
+        <w:t/>
       </w:r>
       <w:proofErr w:type="spellEnd"/>
       <w:r>
-        <w:t>)</w:t>
+        <w:t/>
       </w:r>
     </w:p>
     <w:p>

</xml_diff>

<commit_message>
Publish revised syllabus office hours wording
</commit_message>
<xml_diff>
--- a/syllabus/Intro_Climate_Modeling_Syllabus_Fall2026.docx
+++ b/syllabus/Intro_Climate_Modeling_Syllabus_Fall2026.docx
@@ -120,15 +120,15 @@
     </w:p>
     <w:p>
       <w:r>
-        <w:t xml:space="preserve">Office hours: TBD (to be announced on </w:t>
+        <w:t xml:space="preserve">Office hours: As discussed by TAs</w:t>
       </w:r>
       <w:proofErr w:type="spellStart"/>
       <w:r>
-        <w:t>Courseworks</w:t>
+        <w:t/>
       </w:r>
       <w:proofErr w:type="spellEnd"/>
       <w:r>
-        <w:t>)</w:t>
+        <w:t/>
       </w:r>
     </w:p>
     <w:p>

</xml_diff>

<commit_message>
Move syllabus project topic and team deadline to November 6
</commit_message>
<xml_diff>
--- a/syllabus/Intro_Climate_Modeling_Syllabus_Fall2026.docx
+++ b/syllabus/Intro_Climate_Modeling_Syllabus_Fall2026.docx
@@ -1329,7 +1329,7 @@
           </w:tcPr>
           <w:p>
             <w:r>
-              <w:t>Week 7</w:t>
+              <w:t>Week 9</w:t>
             </w:r>
           </w:p>
         </w:tc>
@@ -1351,7 +1351,7 @@
           </w:tcPr>
           <w:p>
             <w:r>
-              <w:t xml:space="preserve">Friday 23 October.</w:t>
+              <w:t xml:space="preserve">Friday 6 November.</w:t>
             </w:r>
           </w:p>
         </w:tc>
@@ -1972,7 +1972,7 @@
         <w:rPr>
           <w:highlight w:val="white"/>
         </w:rPr>
-        <w:t xml:space="preserve">Project topic and team selection is due in week 7, Friday October 23. Timely submission will count towards 10% of the grade, and late assignment policy (see below) would apply.</w:t>
+        <w:t xml:space="preserve">Project topic and team selection is due in week 9, Friday November 6. Timely submission will count towards 10% of the grade, and late assignment policy (see below) would apply.</w:t>
       </w:r>
       <w:r>
         <w:rPr>
@@ -3092,7 +3092,7 @@
               <w:rPr>
                 <w:rtl w:val="0"/>
               </w:rPr>
-              <w:t xml:space="preserve">Project topic and team selection due (23 Oct)</w:t>
+              <w:t xml:space="preserve"/>
             </w:r>
           </w:p>
         </w:tc>
@@ -3289,6 +3289,9 @@
               <w:rPr>
                 <w:rtl w:val="0"/>
               </w:rPr>
+            </w:r>
+            <w:r>
+              <w:t>Project topic and team selection due (6 Nov)</w:t>
             </w:r>
           </w:p>
         </w:tc>

</xml_diff>

<commit_message>
Publish November 6 project deadline in syllabus
</commit_message>
<xml_diff>
--- a/syllabus/Intro_Climate_Modeling_Syllabus_Fall2026.docx
+++ b/syllabus/Intro_Climate_Modeling_Syllabus_Fall2026.docx
@@ -1329,7 +1329,7 @@
           </w:tcPr>
           <w:p>
             <w:r>
-              <w:t>Week 7</w:t>
+              <w:t>Week 9</w:t>
             </w:r>
           </w:p>
         </w:tc>
@@ -1351,7 +1351,7 @@
           </w:tcPr>
           <w:p>
             <w:r>
-              <w:t xml:space="preserve">Friday 23 October.</w:t>
+              <w:t xml:space="preserve">Friday 6 November.</w:t>
             </w:r>
           </w:p>
         </w:tc>
@@ -1972,7 +1972,7 @@
         <w:rPr>
           <w:highlight w:val="white"/>
         </w:rPr>
-        <w:t xml:space="preserve">Project topic and team selection is due in week 7, Friday October 23. Timely submission will count towards 10% of the grade, and late assignment policy (see below) would apply.</w:t>
+        <w:t xml:space="preserve">Project topic and team selection is due in week 9, Friday November 6. Timely submission will count towards 10% of the grade, and late assignment policy (see below) would apply.</w:t>
       </w:r>
       <w:r>
         <w:rPr>
@@ -3092,7 +3092,7 @@
               <w:rPr>
                 <w:rtl w:val="0"/>
               </w:rPr>
-              <w:t xml:space="preserve">Project topic and team selection due (23 Oct)</w:t>
+              <w:t xml:space="preserve"/>
             </w:r>
           </w:p>
         </w:tc>
@@ -3289,6 +3289,9 @@
               <w:rPr>
                 <w:rtl w:val="0"/>
               </w:rPr>
+            </w:r>
+            <w:r>
+              <w:t>Project topic and team selection due (6 Nov)</w:t>
             </w:r>
           </w:p>
         </w:tc>

</xml_diff>